<commit_message>
Initial commit for Text Exercise
</commit_message>
<xml_diff>
--- a/src/Sirma_May_2024_13_StreamsAndFiles/13. Streams & Files - Exercise.docx
+++ b/src/Sirma_May_2024_13_StreamsAndFiles/13. Streams & Files - Exercise.docx
@@ -899,13 +899,7 @@
             <w:rPr>
               <w:color w:val="000000"/>
             </w:rPr>
-            <w:t>*Extract Speci</w:t>
-          </w:r>
-          <w:r>
-            <w:rPr>
-              <w:color w:val="000000"/>
-            </w:rPr>
-            <w:t>fic Files from Zip Archive</w:t>
+            <w:t>*Extract Specific Files from Zip Archive</w:t>
           </w:r>
           <w:r>
             <w:rPr>
@@ -963,13 +957,7 @@
         <w:rPr>
           <w:color w:val="44546A"/>
         </w:rPr>
-        <w:t>Write a program that reads a text file ("input.txt"</w:t>
-      </w:r>
-      <w:r>
-        <w:rPr>
-          <w:color w:val="44546A"/>
-        </w:rPr>
-        <w:t>) and prints on the console the length of each word in the file. Use BufferedReader in combination with FileReader.</w:t>
+        <w:t>Write a program that reads a text file ("input.txt") and prints on the console the length of each word in the file. Use BufferedReader in combination with FileReader.</w:t>
       </w:r>
     </w:p>
     <w:p>
@@ -1189,13 +1177,7 @@
         <w:rPr>
           <w:color w:val="44546A"/>
         </w:rPr>
-        <w:t>Write a program that reads a text file ("input.txt"</w:t>
-      </w:r>
-      <w:r>
-        <w:rPr>
-          <w:color w:val="44546A"/>
-        </w:rPr>
-        <w:t>) and prints on the console the frequency of each character in the file. Use BufferedReader in combination with FileReader.</w:t>
+        <w:t>Write a program that reads a text file ("input.txt") and prints on the console the frequency of each character in the file. Use BufferedReader in combination with FileReader.</w:t>
       </w:r>
     </w:p>
     <w:p>
@@ -1811,13 +1793,7 @@
         <w:rPr>
           <w:color w:val="44546A"/>
         </w:rPr>
-        <w:t>Write a program that reads the path to a file and subtracts the file name and its extens</w:t>
-      </w:r>
-      <w:r>
-        <w:rPr>
-          <w:color w:val="44546A"/>
-        </w:rPr>
-        <w:t>ion.</w:t>
+        <w:t>Write a program that reads the path to a file and subtracts the file name and its extension.</w:t>
       </w:r>
     </w:p>
     <w:p>
@@ -2358,13 +2334,7 @@
         <w:rPr>
           <w:color w:val="44546A"/>
         </w:rPr>
-        <w:t xml:space="preserve">This is a test file. This file is just </w:t>
-      </w:r>
-      <w:r>
-        <w:rPr>
-          <w:color w:val="44546A"/>
-        </w:rPr>
-        <w:t>a test.</w:t>
+        <w:t>This is a test file. This file is just a test.</w:t>
       </w:r>
     </w:p>
     <w:p>
@@ -2508,13 +2478,7 @@
         <w:rPr>
           <w:color w:val="44546A"/>
         </w:rPr>
-        <w:t>Write a program that reads lines from two text files ("input1.txt" and "input2.txt"</w:t>
-      </w:r>
-      <w:r>
-        <w:rPr>
-          <w:color w:val="44546A"/>
-        </w:rPr>
-        <w:t>) and writes them alternatively into a third file ("output.txt").</w:t>
+        <w:t>Write a program that reads lines from two text files ("input1.txt" and "input2.txt") and writes them alternatively into a third file ("output.txt").</w:t>
       </w:r>
     </w:p>
     <w:p>
@@ -2790,13 +2754,7 @@
         <w:rPr>
           <w:color w:val="44546A"/>
         </w:rPr>
-        <w:t>Write a program that calculates the total size of all files in a directory (in</w:t>
-      </w:r>
-      <w:r>
-        <w:rPr>
-          <w:color w:val="44546A"/>
-        </w:rPr>
-        <w:t xml:space="preserve">cluding subdirectories). </w:t>
+        <w:t xml:space="preserve">Write a program that calculates the total size of all files in a directory (including subdirectories). </w:t>
       </w:r>
     </w:p>
     <w:p>
@@ -2889,7 +2847,6 @@
         <w:rPr>
           <w:color w:val="44546A"/>
         </w:rPr>
-        <w:lastRenderedPageBreak/>
         <w:t>Recursively calculate the size of all files.</w:t>
       </w:r>
     </w:p>
@@ -2911,6 +2868,7 @@
         <w:rPr>
           <w:color w:val="44546A"/>
         </w:rPr>
+        <w:lastRenderedPageBreak/>
         <w:t>Copy File Content</w:t>
       </w:r>
     </w:p>
@@ -2925,13 +2883,7 @@
         <w:rPr>
           <w:color w:val="44546A"/>
         </w:rPr>
-        <w:t>Write a program that copies the content of a text file ("input.txt"</w:t>
-      </w:r>
-      <w:r>
-        <w:rPr>
-          <w:color w:val="44546A"/>
-        </w:rPr>
-        <w:t>) to another file ("output.txt") using BufferedInputStream and BufferedOutputStream.</w:t>
+        <w:t>Write a program that copies the content of a text file ("input.txt") to another file ("output.txt") using BufferedInputStream and BufferedOutputStream.</w:t>
       </w:r>
     </w:p>
     <w:p>
@@ -3157,13 +3109,7 @@
         <w:rPr>
           <w:color w:val="44546A"/>
         </w:rPr>
-        <w:t>Write a program that saves and loads a list of custom objects (Person) using ObjectInputStream and ObjectOutputStream</w:t>
-      </w:r>
-      <w:r>
-        <w:rPr>
-          <w:color w:val="44546A"/>
-        </w:rPr>
-        <w:t>. The Person class should have fields: String name and int age. Set the name of the save file as "persons.ser".</w:t>
+        <w:t>Write a program that saves and loads a list of custom objects (Person) using ObjectInputStream and ObjectOutputStream. The Person class should have fields: String name and int age. Set the name of the save file as "persons.ser".</w:t>
       </w:r>
     </w:p>
     <w:p>
@@ -3337,13 +3283,7 @@
         <w:rPr>
           <w:color w:val="44546A"/>
         </w:rPr>
-        <w:t>Use Zip</w:t>
-      </w:r>
-      <w:r>
-        <w:rPr>
-          <w:color w:val="44546A"/>
-        </w:rPr>
-        <w:t>InputStream to read the zip archive.</w:t>
+        <w:t>Use ZipInputStream to read the zip archive.</w:t>
       </w:r>
     </w:p>
     <w:p>
@@ -3470,7 +3410,7 @@
       </w:rPr>
     </w:pPr>
     <ve:AlternateContent>
-      <mc:Choice xmlns:cr="http://schemas.microsoft.com/office/comments/2020/reactions" xmlns:w16cid="http://schemas.microsoft.com/office/word/2016/wordml/cid" xmlns:w16cex="http://schemas.microsoft.com/office/word/2018/wordml/cex" xmlns:w16="http://schemas.microsoft.com/office/word/2018/wordml" xmlns:w15="http://schemas.microsoft.com/office/word/2012/wordml" xmlns:w14="http://schemas.microsoft.com/office/word/2010/wordml" xmlns:wpg="http://schemas.microsoft.com/office/word/2010/wordprocessingGroup" xmlns:wps="http://schemas.microsoft.com/office/word/2010/wordprocessingShape" xmlns:dgm="http://schemas.openxmlformats.org/drawingml/2006/diagram" xmlns:lc="http://schemas.openxmlformats.org/drawingml/2006/lockedCanvas" xmlns:c="http://schemas.openxmlformats.org/drawingml/2006/chart" xmlns:pic="http://schemas.openxmlformats.org/drawingml/2006/picture" xmlns:a="http://schemas.openxmlformats.org/drawingml/2006/main" xmlns:sl="http://schemas.openxmlformats.org/schemaLibrary/2006/main" xmlns:mc="http://schemas.openxmlformats.org/markup-compatibility/2006" Requires="wpg">
+      <mc:Choice xmlns:mc="http://schemas.openxmlformats.org/markup-compatibility/2006" xmlns:sl="http://schemas.openxmlformats.org/schemaLibrary/2006/main" xmlns:a="http://schemas.openxmlformats.org/drawingml/2006/main" xmlns:pic="http://schemas.openxmlformats.org/drawingml/2006/picture" xmlns:c="http://schemas.openxmlformats.org/drawingml/2006/chart" xmlns:lc="http://schemas.openxmlformats.org/drawingml/2006/lockedCanvas" xmlns:dgm="http://schemas.openxmlformats.org/drawingml/2006/diagram" xmlns:wps="http://schemas.microsoft.com/office/word/2010/wordprocessingShape" xmlns:wpg="http://schemas.microsoft.com/office/word/2010/wordprocessingGroup" xmlns:w14="http://schemas.microsoft.com/office/word/2010/wordml" xmlns:w15="http://schemas.microsoft.com/office/word/2012/wordml" xmlns:w16="http://schemas.microsoft.com/office/word/2018/wordml" xmlns:w16cex="http://schemas.microsoft.com/office/word/2018/wordml/cex" xmlns:w16cid="http://schemas.microsoft.com/office/word/2016/wordml/cid" xmlns:cr="http://schemas.microsoft.com/office/comments/2020/reactions" Requires="wpg">
         <w:drawing>
           <wp:anchor allowOverlap="1" behindDoc="0" distB="45720" distT="45720" distL="114300" distR="114300" hidden="0" layoutInCell="1" locked="0" relativeHeight="0" simplePos="0">
             <wp:simplePos x="0" y="0"/>
@@ -3540,7 +3480,6 @@
         <w:r>
           <w:rPr>
             <w:noProof/>
-            <w:lang w:val="bg-BG"/>
           </w:rPr>
           <w:drawing>
             <wp:anchor distT="45720" distB="45720" distL="114300" distR="114300" simplePos="0" relativeHeight="251660288" behindDoc="0" locked="0" layoutInCell="1" allowOverlap="1">
@@ -3641,7 +3580,6 @@
     <w:r>
       <w:rPr>
         <w:noProof/>
-        <w:lang w:val="bg-BG"/>
       </w:rPr>
       <w:drawing>
         <wp:anchor distT="0" distB="0" distL="0" distR="0" simplePos="0" relativeHeight="251658240" behindDoc="1" locked="0" layoutInCell="1" allowOverlap="1">
@@ -3688,7 +3626,7 @@
       </w:drawing>
     </w:r>
     <ve:AlternateContent>
-      <mc:Choice xmlns:cr="http://schemas.microsoft.com/office/comments/2020/reactions" xmlns:w16cid="http://schemas.microsoft.com/office/word/2016/wordml/cid" xmlns:w16cex="http://schemas.microsoft.com/office/word/2018/wordml/cex" xmlns:w16="http://schemas.microsoft.com/office/word/2018/wordml" xmlns:w15="http://schemas.microsoft.com/office/word/2012/wordml" xmlns:w14="http://schemas.microsoft.com/office/word/2010/wordml" xmlns:wpg="http://schemas.microsoft.com/office/word/2010/wordprocessingGroup" xmlns:wps="http://schemas.microsoft.com/office/word/2010/wordprocessingShape" xmlns:dgm="http://schemas.openxmlformats.org/drawingml/2006/diagram" xmlns:lc="http://schemas.openxmlformats.org/drawingml/2006/lockedCanvas" xmlns:c="http://schemas.openxmlformats.org/drawingml/2006/chart" xmlns:pic="http://schemas.openxmlformats.org/drawingml/2006/picture" xmlns:a="http://schemas.openxmlformats.org/drawingml/2006/main" xmlns:sl="http://schemas.openxmlformats.org/schemaLibrary/2006/main" xmlns:mc="http://schemas.openxmlformats.org/markup-compatibility/2006" Requires="wpg">
+      <mc:Choice xmlns:mc="http://schemas.openxmlformats.org/markup-compatibility/2006" xmlns:sl="http://schemas.openxmlformats.org/schemaLibrary/2006/main" xmlns:a="http://schemas.openxmlformats.org/drawingml/2006/main" xmlns:pic="http://schemas.openxmlformats.org/drawingml/2006/picture" xmlns:c="http://schemas.openxmlformats.org/drawingml/2006/chart" xmlns:lc="http://schemas.openxmlformats.org/drawingml/2006/lockedCanvas" xmlns:dgm="http://schemas.openxmlformats.org/drawingml/2006/diagram" xmlns:wps="http://schemas.microsoft.com/office/word/2010/wordprocessingShape" xmlns:wpg="http://schemas.microsoft.com/office/word/2010/wordprocessingGroup" xmlns:w14="http://schemas.microsoft.com/office/word/2010/wordml" xmlns:w15="http://schemas.microsoft.com/office/word/2012/wordml" xmlns:w16="http://schemas.microsoft.com/office/word/2018/wordml" xmlns:w16cex="http://schemas.microsoft.com/office/word/2018/wordml/cex" xmlns:w16cid="http://schemas.microsoft.com/office/word/2016/wordml/cid" xmlns:cr="http://schemas.microsoft.com/office/comments/2020/reactions" Requires="wpg">
         <w:drawing>
           <wp:anchor allowOverlap="1" behindDoc="0" distB="45720" distT="45720" distL="114300" distR="114300" hidden="0" layoutInCell="1" locked="0" relativeHeight="0" simplePos="0">
             <wp:simplePos x="0" y="0"/>
@@ -3903,7 +3841,6 @@
         <w:r>
           <w:rPr>
             <w:noProof/>
-            <w:lang w:val="bg-BG"/>
           </w:rPr>
           <w:drawing>
             <wp:anchor distT="45720" distB="45720" distL="114300" distR="114300" simplePos="0" relativeHeight="251659264" behindDoc="0" locked="0" layoutInCell="1" allowOverlap="1">
@@ -5333,7 +5270,7 @@
         <w:rFonts w:ascii="Verdana" w:eastAsia="Verdana" w:hAnsi="Verdana" w:cs="Verdana"/>
         <w:sz w:val="22"/>
         <w:szCs w:val="22"/>
-        <w:lang w:eastAsia="bg-BG" w:bidi="ar-SA"/>
+        <w:lang w:val="bg-BG" w:eastAsia="bg-BG" w:bidi="ar-SA"/>
       </w:rPr>
     </w:rPrDefault>
     <w:pPrDefault>
@@ -5484,6 +5421,7 @@
   <w:style w:type="paragraph" w:default="1" w:styleId="Normal">
     <w:name w:val="Normal"/>
     <w:qFormat/>
+    <w:rsid w:val="00966C76"/>
   </w:style>
   <w:style w:type="paragraph" w:styleId="Heading1">
     <w:name w:val="heading 1"/>

</xml_diff>